<commit_message>
Adding Assignment 1.3 to module-1
</commit_message>
<xml_diff>
--- a/module-1/Summers-Assignment1_2.docx
+++ b/module-1/Summers-Assignment1_2.docx
@@ -44,13 +44,61 @@
         </w:drawing>
       </w:r>
     </w:p>
+    <w:p>
+      <w:r>
+        <w:rPr>
+          <w:noProof/>
+        </w:rPr>
+        <w:drawing>
+          <wp:inline distT="0" distB="0" distL="0" distR="0" wp14:anchorId="378839EC" wp14:editId="7A0B18F7">
+            <wp:extent cx="5943600" cy="734060"/>
+            <wp:effectExtent l="0" t="0" r="0" b="8890"/>
+            <wp:docPr id="429424989" name="Picture 1"/>
+            <wp:cNvGraphicFramePr>
+              <a:graphicFrameLocks xmlns:a="http://schemas.openxmlformats.org/drawingml/2006/main" noChangeAspect="1"/>
+            </wp:cNvGraphicFramePr>
+            <a:graphic xmlns:a="http://schemas.openxmlformats.org/drawingml/2006/main">
+              <a:graphicData uri="http://schemas.openxmlformats.org/drawingml/2006/picture">
+                <pic:pic xmlns:pic="http://schemas.openxmlformats.org/drawingml/2006/picture">
+                  <pic:nvPicPr>
+                    <pic:cNvPr id="429424989" name=""/>
+                    <pic:cNvPicPr/>
+                  </pic:nvPicPr>
+                  <pic:blipFill>
+                    <a:blip r:embed="rId7"/>
+                    <a:stretch>
+                      <a:fillRect/>
+                    </a:stretch>
+                  </pic:blipFill>
+                  <pic:spPr>
+                    <a:xfrm>
+                      <a:off x="0" y="0"/>
+                      <a:ext cx="5943600" cy="734060"/>
+                    </a:xfrm>
+                    <a:prstGeom prst="rect">
+                      <a:avLst/>
+                    </a:prstGeom>
+                  </pic:spPr>
+                </pic:pic>
+              </a:graphicData>
+            </a:graphic>
+          </wp:inline>
+        </w:drawing>
+      </w:r>
+    </w:p>
+    <w:p>
+      <w:r>
+        <w:t>https://github.com/Jack-Summers/csd-325.git</w:t>
+      </w:r>
+    </w:p>
+    <w:p/>
     <w:sectPr>
-      <w:headerReference w:type="even" r:id="rId7"/>
-      <w:headerReference w:type="default" r:id="rId8"/>
-      <w:footerReference w:type="even" r:id="rId9"/>
-      <w:footerReference w:type="default" r:id="rId10"/>
-      <w:headerReference w:type="first" r:id="rId11"/>
-      <w:footerReference w:type="first" r:id="rId12"/>
+      <w:headerReference w:type="even" r:id="rId8"/>
+      <w:headerReference w:type="default" r:id="rId9"/>
+      <w:footerReference w:type="even" r:id="rId10"/>
+      <w:footerReference w:type="default" r:id="rId11"/>
+      <w:headerReference w:type="first" r:id="rId12"/>
+      <w:footerReference w:type="first" r:id="rId13"/>
       <w:pgSz w:w="12240" w:h="15840"/>
       <w:pgMar w:top="1440" w:right="1440" w:bottom="1440" w:left="1440" w:header="720" w:footer="720" w:gutter="0"/>
       <w:cols w:space="720"/>

</xml_diff>